<commit_message>
Añadido en TechStore.docx algunas posibles funcionalidades para implementar en la aplicación para que sea mejor
</commit_message>
<xml_diff>
--- a/TechStore.docx
+++ b/TechStore.docx
@@ -73,8 +73,6 @@
       </w:r>
       <w:r>
         <w:br/>
-      </w:r>
-      <w:r>
         <w:t>- Gestionar el catálogo de dispositivos</w:t>
       </w:r>
       <w:r>
@@ -126,10 +124,7 @@
       </w:r>
       <w:proofErr w:type="spellEnd"/>
       <w:r>
-        <w:t xml:space="preserve"> (</w:t>
-      </w:r>
-      <w:r>
-        <w:t>Spring MVC)</w:t>
+        <w:t xml:space="preserve"> (Spring MVC)</w:t>
       </w:r>
       <w:r>
         <w:br/>
@@ -241,13 +236,7 @@
     </w:p>
     <w:p>
       <w:r>
-        <w:t>E</w:t>
-      </w:r>
-      <w:r>
-        <w:t>ntidades y campos míni</w:t>
-      </w:r>
-      <w:r>
-        <w:t>mos:</w:t>
+        <w:t>Entidades y campos mínimos:</w:t>
       </w:r>
       <w:r>
         <w:br/>
@@ -366,10 +355,7 @@
       </w:r>
       <w:r>
         <w:br/>
-        <w:t>- Un Pedido pertenece a un Cl</w:t>
-      </w:r>
-      <w:r>
-        <w:t>iente</w:t>
+        <w:t>- Un Pedido pertenece a un Cliente</w:t>
       </w:r>
       <w:r>
         <w:br/>
@@ -429,10 +415,7 @@
     </w:p>
     <w:p>
       <w:r>
-        <w:t>CRUD completo de Producto, Pedido y Client</w:t>
-      </w:r>
-      <w:r>
-        <w:t>e</w:t>
+        <w:t>CRUD completo de Producto, Pedido y Cliente</w:t>
       </w:r>
       <w:r>
         <w:br/>
@@ -478,10 +461,7 @@
         <w:pStyle w:val="Ttulo1"/>
       </w:pPr>
       <w:r>
-        <w:t>5. Validaciones y E</w:t>
-      </w:r>
-      <w:r>
-        <w:t>xcepciones</w:t>
+        <w:t>5. Validaciones y Excepciones</w:t>
       </w:r>
     </w:p>
     <w:p/>
@@ -645,10 +625,7 @@
       </w:r>
       <w:proofErr w:type="spellStart"/>
       <w:r>
-        <w:t>Boo</w:t>
-      </w:r>
-      <w:r>
-        <w:t>tstrap</w:t>
+        <w:t>Bootstrap</w:t>
       </w:r>
       <w:proofErr w:type="spellEnd"/>
       <w:r>
@@ -729,10 +706,7 @@
       </w:r>
       <w:r>
         <w:br/>
-        <w:t>Us</w:t>
-      </w:r>
-      <w:r>
-        <w:t xml:space="preserve">o de GitHub </w:t>
+        <w:t xml:space="preserve">Uso de GitHub </w:t>
       </w:r>
       <w:proofErr w:type="spellStart"/>
       <w:r>
@@ -1045,17 +1019,169 @@
         <w:t xml:space="preserve">Por lo </w:t>
       </w:r>
       <w:r>
-        <w:t>q</w:t>
+        <w:t>que</w:t>
+      </w:r>
+      <w:r>
+        <w:t xml:space="preserve"> mi página web se basará en</w:t>
+      </w:r>
+      <w:r>
+        <w:t xml:space="preserve"> electrodomésticos de alta gama.</w:t>
+      </w:r>
+    </w:p>
+    <w:p/>
+    <w:p>
+      <w:r>
+        <w:t xml:space="preserve">Posibles funcionalidades a añadir en </w:t>
+      </w:r>
+      <w:proofErr w:type="spellStart"/>
+      <w:r>
+        <w:t>TechStore</w:t>
+      </w:r>
+      <w:proofErr w:type="spellEnd"/>
+      <w:r>
+        <w:t>:</w:t>
+      </w:r>
+    </w:p>
+    <w:p>
+      <w:pPr>
+        <w:pStyle w:val="Prrafodelista"/>
+        <w:numPr>
+          <w:ilvl w:val="0"/>
+          <w:numId w:val="7"/>
+        </w:numPr>
+      </w:pPr>
+      <w:r>
+        <w:t>Exportación de factura a PDF (Todo desglosado en un PDF)</w:t>
+      </w:r>
+    </w:p>
+    <w:p>
+      <w:pPr>
+        <w:pStyle w:val="Prrafodelista"/>
+        <w:numPr>
+          <w:ilvl w:val="0"/>
+          <w:numId w:val="7"/>
+        </w:numPr>
+      </w:pPr>
+      <w:r>
+        <w:t>Sistema de cupones/descuentos (Si el precio de la compra sobrepasa una cantidad ponerle un descuento al precio final)</w:t>
       </w:r>
       <w:bookmarkStart w:id="0" w:name="_GoBack"/>
       <w:bookmarkEnd w:id="0"/>
-      <w:r>
-        <w:t>ue</w:t>
-      </w:r>
-      <w:r>
-        <w:t xml:space="preserve"> mi página web se basará en electrodomésticos de alta gama </w:t>
-      </w:r>
     </w:p>
+    <w:p>
+      <w:pPr>
+        <w:pStyle w:val="Prrafodelista"/>
+        <w:numPr>
+          <w:ilvl w:val="0"/>
+          <w:numId w:val="7"/>
+        </w:numPr>
+      </w:pPr>
+      <w:r>
+        <w:t>Historial de pedidos del cliente (Página donde ver tus pedidos según el cliente que seas)</w:t>
+      </w:r>
+    </w:p>
+    <w:p>
+      <w:pPr>
+        <w:pStyle w:val="Prrafodelista"/>
+        <w:numPr>
+          <w:ilvl w:val="0"/>
+          <w:numId w:val="7"/>
+        </w:numPr>
+      </w:pPr>
+      <w:r>
+        <w:t>Página de detalle de producto (Mejorar el estilo de la web aumentando el desglose del producto con sus especificaciones y también va unido con los productos relacionados)</w:t>
+      </w:r>
+    </w:p>
+    <w:p>
+      <w:pPr>
+        <w:pStyle w:val="Prrafodelista"/>
+        <w:numPr>
+          <w:ilvl w:val="0"/>
+          <w:numId w:val="7"/>
+        </w:numPr>
+      </w:pPr>
+      <w:r>
+        <w:t>Sistema de valoraciones (No tiene más, valoraciones de 1 – 5 estrellas por producto y un comentario)</w:t>
+      </w:r>
+    </w:p>
+    <w:p>
+      <w:pPr>
+        <w:pStyle w:val="Prrafodelista"/>
+        <w:numPr>
+          <w:ilvl w:val="0"/>
+          <w:numId w:val="7"/>
+        </w:numPr>
+      </w:pPr>
+      <w:r>
+        <w:t>Filtros por marca y precio en el catálogo (Botones de marcas + barra con rango de precio)</w:t>
+      </w:r>
+    </w:p>
+    <w:p>
+      <w:pPr>
+        <w:pStyle w:val="Prrafodelista"/>
+        <w:numPr>
+          <w:ilvl w:val="0"/>
+          <w:numId w:val="7"/>
+        </w:numPr>
+      </w:pPr>
+      <w:r>
+        <w:t xml:space="preserve">Control de acceso a compra sin perfil de cliente (Para solucionar el error silencioso de un </w:t>
+      </w:r>
+      <w:proofErr w:type="spellStart"/>
+      <w:r>
+        <w:t>admin</w:t>
+      </w:r>
+      <w:proofErr w:type="spellEnd"/>
+      <w:r>
+        <w:t xml:space="preserve"> intentando hacer un pedido)</w:t>
+      </w:r>
+    </w:p>
+    <w:p>
+      <w:pPr>
+        <w:pStyle w:val="Prrafodelista"/>
+        <w:numPr>
+          <w:ilvl w:val="0"/>
+          <w:numId w:val="7"/>
+        </w:numPr>
+      </w:pPr>
+      <w:r>
+        <w:t>Productos relacionados en detalle (Cuando entras en un producto te salen algunos relacionados con ese)</w:t>
+      </w:r>
+    </w:p>
+    <w:p>
+      <w:pPr>
+        <w:pStyle w:val="Prrafodelista"/>
+        <w:numPr>
+          <w:ilvl w:val="0"/>
+          <w:numId w:val="7"/>
+        </w:numPr>
+      </w:pPr>
+      <w:r>
+        <w:t xml:space="preserve">Buscador con filtro reacondicionados (Una simple </w:t>
+      </w:r>
+      <w:proofErr w:type="spellStart"/>
+      <w:r>
+        <w:t>checkbox</w:t>
+      </w:r>
+      <w:proofErr w:type="spellEnd"/>
+      <w:r>
+        <w:t xml:space="preserve"> para “Solo reacondicionados”)</w:t>
+      </w:r>
+    </w:p>
+    <w:p>
+      <w:pPr>
+        <w:pStyle w:val="Prrafodelista"/>
+        <w:numPr>
+          <w:ilvl w:val="0"/>
+          <w:numId w:val="7"/>
+        </w:numPr>
+      </w:pPr>
+      <w:r>
+        <w:t>Confirmación de pedido (Mensaje con el desglose del pedido para confirmar)</w:t>
+      </w:r>
+    </w:p>
+    <w:p/>
+    <w:p/>
     <w:p/>
     <w:p/>
     <w:sectPr>
@@ -1569,6 +1695,95 @@
     </w:lvl>
   </w:abstractNum>
   <w:abstractNum w:abstractNumId="1" w15:restartNumberingAfterBreak="0">
+    <w:nsid w:val="3221519E"/>
+    <w:multiLevelType w:val="hybridMultilevel"/>
+    <w:tmpl w:val="880CDDB0"/>
+    <w:lvl w:ilvl="0" w:tplc="0C0A000F">
+      <w:start w:val="1"/>
+      <w:numFmt w:val="decimal"/>
+      <w:lvlText w:val="%1."/>
+      <w:lvlJc w:val="left"/>
+      <w:pPr>
+        <w:ind w:left="720" w:hanging="360"/>
+      </w:pPr>
+      <w:rPr>
+        <w:rFonts w:hint="default"/>
+      </w:rPr>
+    </w:lvl>
+    <w:lvl w:ilvl="1" w:tplc="0C0A0019" w:tentative="1">
+      <w:start w:val="1"/>
+      <w:numFmt w:val="lowerLetter"/>
+      <w:lvlText w:val="%2."/>
+      <w:lvlJc w:val="left"/>
+      <w:pPr>
+        <w:ind w:left="1440" w:hanging="360"/>
+      </w:pPr>
+    </w:lvl>
+    <w:lvl w:ilvl="2" w:tplc="0C0A001B" w:tentative="1">
+      <w:start w:val="1"/>
+      <w:numFmt w:val="lowerRoman"/>
+      <w:lvlText w:val="%3."/>
+      <w:lvlJc w:val="right"/>
+      <w:pPr>
+        <w:ind w:left="2160" w:hanging="180"/>
+      </w:pPr>
+    </w:lvl>
+    <w:lvl w:ilvl="3" w:tplc="0C0A000F" w:tentative="1">
+      <w:start w:val="1"/>
+      <w:numFmt w:val="decimal"/>
+      <w:lvlText w:val="%4."/>
+      <w:lvlJc w:val="left"/>
+      <w:pPr>
+        <w:ind w:left="2880" w:hanging="360"/>
+      </w:pPr>
+    </w:lvl>
+    <w:lvl w:ilvl="4" w:tplc="0C0A0019" w:tentative="1">
+      <w:start w:val="1"/>
+      <w:numFmt w:val="lowerLetter"/>
+      <w:lvlText w:val="%5."/>
+      <w:lvlJc w:val="left"/>
+      <w:pPr>
+        <w:ind w:left="3600" w:hanging="360"/>
+      </w:pPr>
+    </w:lvl>
+    <w:lvl w:ilvl="5" w:tplc="0C0A001B" w:tentative="1">
+      <w:start w:val="1"/>
+      <w:numFmt w:val="lowerRoman"/>
+      <w:lvlText w:val="%6."/>
+      <w:lvlJc w:val="right"/>
+      <w:pPr>
+        <w:ind w:left="4320" w:hanging="180"/>
+      </w:pPr>
+    </w:lvl>
+    <w:lvl w:ilvl="6" w:tplc="0C0A000F" w:tentative="1">
+      <w:start w:val="1"/>
+      <w:numFmt w:val="decimal"/>
+      <w:lvlText w:val="%7."/>
+      <w:lvlJc w:val="left"/>
+      <w:pPr>
+        <w:ind w:left="5040" w:hanging="360"/>
+      </w:pPr>
+    </w:lvl>
+    <w:lvl w:ilvl="7" w:tplc="0C0A0019" w:tentative="1">
+      <w:start w:val="1"/>
+      <w:numFmt w:val="lowerLetter"/>
+      <w:lvlText w:val="%8."/>
+      <w:lvlJc w:val="left"/>
+      <w:pPr>
+        <w:ind w:left="5760" w:hanging="360"/>
+      </w:pPr>
+    </w:lvl>
+    <w:lvl w:ilvl="8" w:tplc="0C0A001B" w:tentative="1">
+      <w:start w:val="1"/>
+      <w:numFmt w:val="lowerRoman"/>
+      <w:lvlText w:val="%9."/>
+      <w:lvlJc w:val="right"/>
+      <w:pPr>
+        <w:ind w:left="6480" w:hanging="180"/>
+      </w:pPr>
+    </w:lvl>
+  </w:abstractNum>
+  <w:abstractNum w:abstractNumId="2" w15:restartNumberingAfterBreak="0">
     <w:nsid w:val="61BE118B"/>
     <w:multiLevelType w:val="hybridMultilevel"/>
     <w:tmpl w:val="25102008"/>
@@ -1681,7 +1896,7 @@
       </w:rPr>
     </w:lvl>
   </w:abstractNum>
-  <w:abstractNum w:abstractNumId="2" w15:restartNumberingAfterBreak="0">
+  <w:abstractNum w:abstractNumId="3" w15:restartNumberingAfterBreak="0">
     <w:nsid w:val="73D62256"/>
     <w:multiLevelType w:val="hybridMultilevel"/>
     <w:tmpl w:val="9872B266"/>
@@ -1888,9 +2103,12 @@
     </w:lvlOverride>
   </w:num>
   <w:num w:numId="5">
+    <w:abstractNumId w:val="3"/>
+  </w:num>
+  <w:num w:numId="6">
     <w:abstractNumId w:val="2"/>
   </w:num>
-  <w:num w:numId="6">
+  <w:num w:numId="7">
     <w:abstractNumId w:val="1"/>
   </w:num>
 </w:numbering>
@@ -14311,7 +14529,7 @@
 </file>
 
 <file path=customXml/itemProps2.xml><?xml version="1.0" encoding="utf-8"?>
-<ds:datastoreItem xmlns:ds="http://schemas.openxmlformats.org/officeDocument/2006/customXml" ds:itemID="{3D85079F-6C8B-4DDA-B248-18C7ACF2CE59}">
+<ds:datastoreItem xmlns:ds="http://schemas.openxmlformats.org/officeDocument/2006/customXml" ds:itemID="{D3EC8DC3-49A4-401C-9FE3-FEAF9D4A8E4B}">
   <ds:schemaRefs>
     <ds:schemaRef ds:uri="http://schemas.openxmlformats.org/officeDocument/2006/bibliography"/>
   </ds:schemaRefs>

</xml_diff>

<commit_message>
Añadida documentación del proyecto
</commit_message>
<xml_diff>
--- a/TechStore.docx
+++ b/TechStore.docx
@@ -886,6 +886,11 @@
       </w:r>
     </w:p>
     <w:p>
+      <w:pPr>
+        <w:rPr>
+          <w:u w:val="single"/>
+        </w:rPr>
+      </w:pPr>
       <w:r>
         <w:t>Se valorará:</w:t>
       </w:r>
@@ -908,289 +913,17 @@
       <w:r>
         <w:br/>
         <w:t>- Buenas prácticas</w:t>
-      </w:r>
-    </w:p>
-    <w:p/>
-    <w:p>
-      <w:pPr>
-        <w:pStyle w:val="Ttulo1"/>
-      </w:pPr>
-      <w:r>
-        <w:lastRenderedPageBreak/>
-        <w:t>15. Trabajo propio</w:t>
-      </w:r>
-    </w:p>
-    <w:p/>
-    <w:p>
-      <w:r>
-        <w:t>Páginas de interés:</w:t>
-      </w:r>
-    </w:p>
-    <w:p>
-      <w:pPr>
-        <w:pStyle w:val="Prrafodelista"/>
-        <w:numPr>
-          <w:ilvl w:val="0"/>
-          <w:numId w:val="6"/>
-        </w:numPr>
-      </w:pPr>
-      <w:hyperlink r:id="rId10" w:history="1">
-        <w:r>
-          <w:rPr>
-            <w:rStyle w:val="Hipervnculo"/>
-          </w:rPr>
-          <w:t>https://www.pccomponentes.com/</w:t>
-        </w:r>
-      </w:hyperlink>
-    </w:p>
-    <w:p>
-      <w:pPr>
-        <w:pStyle w:val="Prrafodelista"/>
-        <w:numPr>
-          <w:ilvl w:val="0"/>
-          <w:numId w:val="6"/>
-        </w:numPr>
-      </w:pPr>
-      <w:hyperlink r:id="rId11" w:history="1">
-        <w:r>
-          <w:rPr>
-            <w:rStyle w:val="Hipervnculo"/>
-          </w:rPr>
-          <w:t>https://www.backmarket.es/</w:t>
-        </w:r>
-      </w:hyperlink>
-      <w:r>
-        <w:t xml:space="preserve"> </w:t>
-      </w:r>
-    </w:p>
-    <w:p>
-      <w:pPr>
-        <w:pStyle w:val="Prrafodelista"/>
-        <w:numPr>
-          <w:ilvl w:val="0"/>
-          <w:numId w:val="6"/>
-        </w:numPr>
-      </w:pPr>
-      <w:hyperlink r:id="rId12" w:history="1">
-        <w:r>
-          <w:rPr>
-            <w:rStyle w:val="Hipervnculo"/>
-          </w:rPr>
-          <w:t>https://www.apple.com/es/</w:t>
-        </w:r>
-      </w:hyperlink>
-      <w:r>
-        <w:t xml:space="preserve"> </w:t>
-      </w:r>
-    </w:p>
-    <w:p>
-      <w:r>
-        <w:t>¿Qué debe hacer la aplicación?</w:t>
-      </w:r>
-    </w:p>
-    <w:p/>
-    <w:p>
-      <w:r>
-        <w:t xml:space="preserve">La aplicación va a ser un estilo a la página web de </w:t>
-      </w:r>
-      <w:proofErr w:type="spellStart"/>
-      <w:r>
-        <w:t>apple</w:t>
-      </w:r>
-      <w:proofErr w:type="spellEnd"/>
-      <w:r>
-        <w:t xml:space="preserve"> con estilo minimalista, imágenes de productos claras</w:t>
-      </w:r>
-      <w:r>
-        <w:t xml:space="preserve">. Voy a centrar la página web y los productos en productos caros y de calidad ya que en el momento de darle el estilo de </w:t>
-      </w:r>
-      <w:proofErr w:type="spellStart"/>
-      <w:r>
-        <w:t>apple</w:t>
-      </w:r>
-      <w:proofErr w:type="spellEnd"/>
-      <w:r>
-        <w:t xml:space="preserve"> unos modelos más nuevos y con un aspecto moderno harán que toda la página se vea más clara, limpia y bonita.</w:t>
-      </w:r>
-    </w:p>
-    <w:p/>
-    <w:p>
-      <w:r>
-        <w:t xml:space="preserve">Por lo </w:t>
-      </w:r>
-      <w:r>
-        <w:t>que</w:t>
-      </w:r>
-      <w:r>
-        <w:t xml:space="preserve"> mi página web se basará en</w:t>
-      </w:r>
-      <w:r>
-        <w:t xml:space="preserve"> electrodomésticos de alta gama.</w:t>
-      </w:r>
-    </w:p>
-    <w:p/>
-    <w:p>
-      <w:r>
-        <w:t xml:space="preserve">Posibles funcionalidades a añadir en </w:t>
-      </w:r>
-      <w:proofErr w:type="spellStart"/>
-      <w:r>
-        <w:t>TechStore</w:t>
-      </w:r>
-      <w:proofErr w:type="spellEnd"/>
-      <w:r>
-        <w:t>:</w:t>
-      </w:r>
-    </w:p>
-    <w:p>
-      <w:pPr>
-        <w:pStyle w:val="Prrafodelista"/>
-        <w:numPr>
-          <w:ilvl w:val="0"/>
-          <w:numId w:val="7"/>
-        </w:numPr>
-      </w:pPr>
-      <w:r>
-        <w:t>Exportación de factura a PDF (Todo desglosado en un PDF)</w:t>
-      </w:r>
-    </w:p>
-    <w:p>
-      <w:pPr>
-        <w:pStyle w:val="Prrafodelista"/>
-        <w:numPr>
-          <w:ilvl w:val="0"/>
-          <w:numId w:val="7"/>
-        </w:numPr>
-      </w:pPr>
-      <w:r>
-        <w:t>Sistema de cupones/descuentos (Si el precio de la compra sobrepasa una cantidad ponerle un descuento al precio final)</w:t>
       </w:r>
       <w:bookmarkStart w:id="0" w:name="_GoBack"/>
       <w:bookmarkEnd w:id="0"/>
     </w:p>
-    <w:p>
-      <w:pPr>
-        <w:pStyle w:val="Prrafodelista"/>
-        <w:numPr>
-          <w:ilvl w:val="0"/>
-          <w:numId w:val="7"/>
-        </w:numPr>
-      </w:pPr>
-      <w:r>
-        <w:t>Historial de pedidos del cliente (Página donde ver tus pedidos según el cliente que seas)</w:t>
-      </w:r>
-    </w:p>
-    <w:p>
-      <w:pPr>
-        <w:pStyle w:val="Prrafodelista"/>
-        <w:numPr>
-          <w:ilvl w:val="0"/>
-          <w:numId w:val="7"/>
-        </w:numPr>
-      </w:pPr>
-      <w:r>
-        <w:t>Página de detalle de producto (Mejorar el estilo de la web aumentando el desglose del producto con sus especificaciones y también va unido con los productos relacionados)</w:t>
-      </w:r>
-    </w:p>
-    <w:p>
-      <w:pPr>
-        <w:pStyle w:val="Prrafodelista"/>
-        <w:numPr>
-          <w:ilvl w:val="0"/>
-          <w:numId w:val="7"/>
-        </w:numPr>
-      </w:pPr>
-      <w:r>
-        <w:t>Sistema de valoraciones (No tiene más, valoraciones de 1 – 5 estrellas por producto y un comentario)</w:t>
-      </w:r>
-    </w:p>
-    <w:p>
-      <w:pPr>
-        <w:pStyle w:val="Prrafodelista"/>
-        <w:numPr>
-          <w:ilvl w:val="0"/>
-          <w:numId w:val="7"/>
-        </w:numPr>
-      </w:pPr>
-      <w:r>
-        <w:t>Filtros por marca y precio en el catálogo (Botones de marcas + barra con rango de precio)</w:t>
-      </w:r>
-    </w:p>
-    <w:p>
-      <w:pPr>
-        <w:pStyle w:val="Prrafodelista"/>
-        <w:numPr>
-          <w:ilvl w:val="0"/>
-          <w:numId w:val="7"/>
-        </w:numPr>
-      </w:pPr>
-      <w:r>
-        <w:t xml:space="preserve">Control de acceso a compra sin perfil de cliente (Para solucionar el error silencioso de un </w:t>
-      </w:r>
-      <w:proofErr w:type="spellStart"/>
-      <w:r>
-        <w:t>admin</w:t>
-      </w:r>
-      <w:proofErr w:type="spellEnd"/>
-      <w:r>
-        <w:t xml:space="preserve"> intentando hacer un pedido)</w:t>
-      </w:r>
-    </w:p>
-    <w:p>
-      <w:pPr>
-        <w:pStyle w:val="Prrafodelista"/>
-        <w:numPr>
-          <w:ilvl w:val="0"/>
-          <w:numId w:val="7"/>
-        </w:numPr>
-      </w:pPr>
-      <w:r>
-        <w:t>Productos relacionados en detalle (Cuando entras en un producto te salen algunos relacionados con ese)</w:t>
-      </w:r>
-    </w:p>
-    <w:p>
-      <w:pPr>
-        <w:pStyle w:val="Prrafodelista"/>
-        <w:numPr>
-          <w:ilvl w:val="0"/>
-          <w:numId w:val="7"/>
-        </w:numPr>
-      </w:pPr>
-      <w:r>
-        <w:t xml:space="preserve">Buscador con filtro reacondicionados (Una simple </w:t>
-      </w:r>
-      <w:proofErr w:type="spellStart"/>
-      <w:r>
-        <w:t>checkbox</w:t>
-      </w:r>
-      <w:proofErr w:type="spellEnd"/>
-      <w:r>
-        <w:t xml:space="preserve"> para “Solo reacondicionados”)</w:t>
-      </w:r>
-    </w:p>
-    <w:p>
-      <w:pPr>
-        <w:pStyle w:val="Prrafodelista"/>
-        <w:numPr>
-          <w:ilvl w:val="0"/>
-          <w:numId w:val="7"/>
-        </w:numPr>
-      </w:pPr>
-      <w:r>
-        <w:t>Confirmación de pedido (Mensaje con el desglose del pedido para confirmar)</w:t>
-      </w:r>
-    </w:p>
-    <w:p/>
-    <w:p/>
-    <w:p/>
-    <w:p/>
     <w:sectPr>
-      <w:headerReference w:type="even" r:id="rId13"/>
-      <w:headerReference w:type="default" r:id="rId14"/>
-      <w:footerReference w:type="even" r:id="rId15"/>
-      <w:footerReference w:type="default" r:id="rId16"/>
-      <w:headerReference w:type="first" r:id="rId17"/>
-      <w:footerReference w:type="first" r:id="rId18"/>
+      <w:headerReference w:type="even" r:id="rId10"/>
+      <w:headerReference w:type="default" r:id="rId11"/>
+      <w:footerReference w:type="even" r:id="rId12"/>
+      <w:footerReference w:type="default" r:id="rId13"/>
+      <w:headerReference w:type="first" r:id="rId14"/>
+      <w:footerReference w:type="first" r:id="rId15"/>
       <w:pgSz w:w="12240" w:h="15840"/>
       <w:pgMar w:top="1440" w:right="1800" w:bottom="1440" w:left="1800" w:header="720" w:footer="720" w:gutter="0"/>
       <w:pgNumType w:start="1"/>
@@ -14529,7 +14262,7 @@
 </file>
 
 <file path=customXml/itemProps2.xml><?xml version="1.0" encoding="utf-8"?>
-<ds:datastoreItem xmlns:ds="http://schemas.openxmlformats.org/officeDocument/2006/customXml" ds:itemID="{D3EC8DC3-49A4-401C-9FE3-FEAF9D4A8E4B}">
+<ds:datastoreItem xmlns:ds="http://schemas.openxmlformats.org/officeDocument/2006/customXml" ds:itemID="{FF980DBC-EB6A-4EF9-ADD4-71B328CB7B03}">
   <ds:schemaRefs>
     <ds:schemaRef ds:uri="http://schemas.openxmlformats.org/officeDocument/2006/bibliography"/>
   </ds:schemaRefs>

</xml_diff>